<commit_message>
atualizando readme e docs
</commit_message>
<xml_diff>
--- a/docs/ProjetoIA.docx
+++ b/docs/ProjetoIA.docx
@@ -406,7 +406,7 @@
       <w:pPr>
         <w:numPr>
           <w:ilvl w:val="0"/>
-          <w:numId w:val="1"/>
+          <w:numId w:val="2"/>
         </w:numPr>
         <w:ind w:left="720" w:hanging="360"/>
         <w:rPr>
@@ -462,7 +462,7 @@
       <w:pPr>
         <w:numPr>
           <w:ilvl w:val="0"/>
-          <w:numId w:val="2"/>
+          <w:numId w:val="3"/>
         </w:numPr>
         <w:spacing w:after="0" w:afterAutospacing="0"/>
         <w:ind w:left="720" w:hanging="360"/>
@@ -482,7 +482,7 @@
       <w:pPr>
         <w:numPr>
           <w:ilvl w:val="0"/>
-          <w:numId w:val="2"/>
+          <w:numId w:val="3"/>
         </w:numPr>
         <w:spacing w:after="0" w:afterAutospacing="0" w:before="0" w:beforeAutospacing="0" w:line="360" w:lineRule="auto"/>
         <w:ind w:left="720" w:hanging="360"/>
@@ -515,7 +515,7 @@
       <w:pPr>
         <w:numPr>
           <w:ilvl w:val="0"/>
-          <w:numId w:val="2"/>
+          <w:numId w:val="3"/>
         </w:numPr>
         <w:spacing w:after="0" w:afterAutospacing="0" w:before="0" w:beforeAutospacing="0" w:line="360" w:lineRule="auto"/>
         <w:ind w:left="720" w:hanging="360"/>
@@ -536,7 +536,7 @@
       <w:pPr>
         <w:numPr>
           <w:ilvl w:val="0"/>
-          <w:numId w:val="2"/>
+          <w:numId w:val="3"/>
         </w:numPr>
         <w:spacing w:after="240" w:before="0" w:beforeAutospacing="0" w:line="360" w:lineRule="auto"/>
         <w:ind w:left="720" w:hanging="360"/>
@@ -1026,18 +1026,6 @@
     </w:p>
     <w:p>
       <w:pPr>
-        <w:rPr>
-          <w:rFonts w:ascii="Times New Roman" w:cs="Times New Roman" w:eastAsia="Times New Roman" w:hAnsi="Times New Roman"/>
-        </w:rPr>
-      </w:pPr>
-      <w:r>
-        <w:rPr>
-          <w:rtl w:val="0"/>
-        </w:rPr>
-      </w:r>
-    </w:p>
-    <w:p>
-      <w:pPr>
         <w:pStyle w:val="Heading1"/>
         <w:ind w:firstLine="0"/>
         <w:rPr>
@@ -1259,11 +1247,6 @@
         </w:rPr>
         <w:t xml:space="preserve">) ou expectativas salariais dinâmicas. Como propostas para trabalhos futuros, sugere-se a evolução do modelo para um sistema híbrido, que combine a filtragem baseada em conteúdo com a filtragem colaborativa (analisando o comportamento de outros usuários com perfis semelhantes). Além disso, a integração com grandes modelos de linguagem (LLMs) poderia ser explorada para gerar feedbacks textuais automáticos indicando quais habilidades faltam para o candidato atingir sua vaga dos sonhos.</w:t>
       </w:r>
-      <w:r>
-        <w:rPr>
-          <w:rtl w:val="0"/>
-        </w:rPr>
-      </w:r>
     </w:p>
     <w:p>
       <w:pPr>
@@ -1273,14 +1256,149 @@
           <w:rFonts w:ascii="Times New Roman" w:cs="Times New Roman" w:eastAsia="Times New Roman" w:hAnsi="Times New Roman"/>
         </w:rPr>
       </w:pPr>
-      <w:bookmarkStart w:colFirst="0" w:colLast="0" w:name="_vbhpih3ahwsa" w:id="11"/>
+      <w:bookmarkStart w:colFirst="0" w:colLast="0" w:name="_bmpbcoajbduj" w:id="11"/>
       <w:bookmarkEnd w:id="11"/>
       <w:r>
         <w:rPr>
           <w:rFonts w:ascii="Times New Roman" w:cs="Times New Roman" w:eastAsia="Times New Roman" w:hAnsi="Times New Roman"/>
           <w:rtl w:val="0"/>
         </w:rPr>
-        <w:t xml:space="preserve">8 REFERÊNCIAS</w:t>
+        <w:t xml:space="preserve">8 LINKS DO PROJETO</w:t>
+      </w:r>
+    </w:p>
+    <w:p>
+      <w:pPr>
+        <w:ind w:firstLine="720"/>
+        <w:rPr>
+          <w:rFonts w:ascii="Times New Roman" w:cs="Times New Roman" w:eastAsia="Times New Roman" w:hAnsi="Times New Roman"/>
+        </w:rPr>
+      </w:pPr>
+      <w:r>
+        <w:rPr>
+          <w:rFonts w:ascii="Times New Roman" w:cs="Times New Roman" w:eastAsia="Times New Roman" w:hAnsi="Times New Roman"/>
+          <w:rtl w:val="0"/>
+        </w:rPr>
+        <w:t xml:space="preserve">Os artefatos deste trabalho, incluindo os datasets, o código-fonte desenvolvido em Jupyter Notebook e este relatório, encontram-se documentados e com acesso público no GitHub. Além disso, a apresentação em vídeo detalhando o funcionamento do sistema está hospedada no YouTube.</w:t>
+      </w:r>
+    </w:p>
+    <w:p>
+      <w:pPr>
+        <w:numPr>
+          <w:ilvl w:val="0"/>
+          <w:numId w:val="1"/>
+        </w:numPr>
+        <w:spacing w:after="0" w:afterAutospacing="0"/>
+        <w:ind w:left="720" w:hanging="360"/>
+        <w:jc w:val="left"/>
+        <w:rPr>
+          <w:rFonts w:ascii="Times New Roman" w:cs="Times New Roman" w:eastAsia="Times New Roman" w:hAnsi="Times New Roman"/>
+        </w:rPr>
+      </w:pPr>
+      <w:r>
+        <w:rPr>
+          <w:rFonts w:ascii="Times New Roman" w:cs="Times New Roman" w:eastAsia="Times New Roman" w:hAnsi="Times New Roman"/>
+          <w:b w:val="1"/>
+          <w:bCs w:val="1"/>
+          <w:rtl w:val="0"/>
+        </w:rPr>
+        <w:t xml:space="preserve">Repositório GitHub:</w:t>
+      </w:r>
+      <w:hyperlink r:id="rId9">
+        <w:r>
+          <w:rPr>
+            <w:rFonts w:ascii="Times New Roman" w:cs="Times New Roman" w:eastAsia="Times New Roman" w:hAnsi="Times New Roman"/>
+            <w:rtl w:val="0"/>
+          </w:rPr>
+          <w:t xml:space="preserve"> </w:t>
+        </w:r>
+      </w:hyperlink>
+      <w:hyperlink r:id="rId10">
+        <w:r>
+          <w:rPr>
+            <w:rFonts w:ascii="Times New Roman" w:cs="Times New Roman" w:eastAsia="Times New Roman" w:hAnsi="Times New Roman"/>
+            <w:color w:val="1155cc"/>
+            <w:u w:val="single"/>
+            <w:rtl w:val="0"/>
+          </w:rPr>
+          <w:t xml:space="preserve">https://github.com/EnzoFerroni/ProjetoIA-RecomendacaoVagas</w:t>
+        </w:r>
+      </w:hyperlink>
+      <w:r>
+        <w:rPr>
+          <w:rtl w:val="0"/>
+        </w:rPr>
+      </w:r>
+    </w:p>
+    <w:p>
+      <w:pPr>
+        <w:numPr>
+          <w:ilvl w:val="0"/>
+          <w:numId w:val="1"/>
+        </w:numPr>
+        <w:spacing w:before="0" w:beforeAutospacing="0"/>
+        <w:ind w:left="720" w:hanging="360"/>
+        <w:jc w:val="left"/>
+        <w:rPr>
+          <w:rFonts w:ascii="Times New Roman" w:cs="Times New Roman" w:eastAsia="Times New Roman" w:hAnsi="Times New Roman"/>
+        </w:rPr>
+      </w:pPr>
+      <w:r>
+        <w:rPr>
+          <w:rFonts w:ascii="Times New Roman" w:cs="Times New Roman" w:eastAsia="Times New Roman" w:hAnsi="Times New Roman"/>
+          <w:b w:val="1"/>
+          <w:bCs w:val="1"/>
+          <w:rtl w:val="0"/>
+        </w:rPr>
+        <w:t xml:space="preserve">Vídeo de Apresentação:</w:t>
+      </w:r>
+      <w:r>
+        <w:rPr>
+          <w:rFonts w:ascii="Times New Roman" w:cs="Times New Roman" w:eastAsia="Times New Roman" w:hAnsi="Times New Roman"/>
+          <w:color w:val="ff0000"/>
+          <w:rtl w:val="0"/>
+        </w:rPr>
+        <w:t xml:space="preserve"> </w:t>
+      </w:r>
+      <w:hyperlink r:id="rId11">
+        <w:r>
+          <w:rPr>
+            <w:rFonts w:ascii="Times New Roman" w:cs="Times New Roman" w:eastAsia="Times New Roman" w:hAnsi="Times New Roman"/>
+            <w:color w:val="1155cc"/>
+            <w:u w:val="single"/>
+            <w:rtl w:val="0"/>
+          </w:rPr>
+          <w:t xml:space="preserve">https://www.youtube.com/watch?v=U4bau8jKEr0</w:t>
+        </w:r>
+      </w:hyperlink>
+      <w:r>
+        <w:rPr>
+          <w:rtl w:val="0"/>
+        </w:rPr>
+      </w:r>
+    </w:p>
+    <w:p>
+      <w:pPr>
+        <w:pStyle w:val="Heading1"/>
+        <w:ind w:firstLine="0"/>
+        <w:rPr>
+          <w:rFonts w:ascii="Times New Roman" w:cs="Times New Roman" w:eastAsia="Times New Roman" w:hAnsi="Times New Roman"/>
+        </w:rPr>
+      </w:pPr>
+      <w:bookmarkStart w:colFirst="0" w:colLast="0" w:name="_vbhpih3ahwsa" w:id="12"/>
+      <w:bookmarkEnd w:id="12"/>
+      <w:r>
+        <w:rPr>
+          <w:rFonts w:ascii="Times New Roman" w:cs="Times New Roman" w:eastAsia="Times New Roman" w:hAnsi="Times New Roman"/>
+          <w:rtl w:val="0"/>
+        </w:rPr>
+        <w:t xml:space="preserve">9</w:t>
+      </w:r>
+      <w:r>
+        <w:rPr>
+          <w:rFonts w:ascii="Times New Roman" w:cs="Times New Roman" w:eastAsia="Times New Roman" w:hAnsi="Times New Roman"/>
+          <w:rtl w:val="0"/>
+        </w:rPr>
+        <w:t xml:space="preserve"> REFERÊNCIAS</w:t>
       </w:r>
     </w:p>
     <w:p>
@@ -1361,14 +1479,14 @@
           <w:rFonts w:ascii="Times New Roman" w:cs="Times New Roman" w:eastAsia="Times New Roman" w:hAnsi="Times New Roman"/>
         </w:rPr>
       </w:pPr>
-      <w:bookmarkStart w:colFirst="0" w:colLast="0" w:name="_zg62jw27nb6t" w:id="12"/>
-      <w:bookmarkEnd w:id="12"/>
-      <w:r>
-        <w:rPr>
-          <w:rFonts w:ascii="Times New Roman" w:cs="Times New Roman" w:eastAsia="Times New Roman" w:hAnsi="Times New Roman"/>
-          <w:rtl w:val="0"/>
-        </w:rPr>
-        <w:t xml:space="preserve">9 BIBLIOGRAFIA</w:t>
+      <w:bookmarkStart w:colFirst="0" w:colLast="0" w:name="_zg62jw27nb6t" w:id="13"/>
+      <w:bookmarkEnd w:id="13"/>
+      <w:r>
+        <w:rPr>
+          <w:rFonts w:ascii="Times New Roman" w:cs="Times New Roman" w:eastAsia="Times New Roman" w:hAnsi="Times New Roman"/>
+          <w:rtl w:val="0"/>
+        </w:rPr>
+        <w:t xml:space="preserve">10 BIBLIOGRAFIA</w:t>
       </w:r>
     </w:p>
     <w:p>
@@ -1441,11 +1559,11 @@
       </w:r>
     </w:p>
     <w:sectPr>
-      <w:headerReference r:id="rId9" w:type="first"/>
-      <w:headerReference r:id="rId10" w:type="even"/>
-      <w:footerReference r:id="rId11" w:type="default"/>
-      <w:footerReference r:id="rId12" w:type="first"/>
-      <w:footerReference r:id="rId13" w:type="even"/>
+      <w:headerReference r:id="rId12" w:type="first"/>
+      <w:headerReference r:id="rId13" w:type="even"/>
+      <w:footerReference r:id="rId14" w:type="default"/>
+      <w:footerReference r:id="rId15" w:type="first"/>
+      <w:footerReference r:id="rId16" w:type="even"/>
       <w:pgSz w:h="16845" w:w="11910" w:orient="portrait"/>
       <w:pgMar w:bottom="1133.8582677165355" w:top="1700.7874015748032" w:left="1700.7874015748032" w:right="1133.8582677165355" w:header="566.9291338582677" w:footer="0"/>
       <w:pgNumType w:start="1"/>
@@ -1612,12 +1730,12 @@
           <wp:extent cx="622935" cy="622935"/>
           <wp:effectExtent b="0" l="0" r="0" t="0"/>
           <wp:wrapSquare wrapText="bothSides" distB="0" distT="0" distL="114300" distR="114300"/>
-          <wp:docPr id="1" name="image4.png"/>
+          <wp:docPr id="1" name="image6.png"/>
           <a:graphic>
             <a:graphicData uri="http://schemas.openxmlformats.org/drawingml/2006/picture">
               <pic:pic>
                 <pic:nvPicPr>
-                  <pic:cNvPr id="0" name="image4.png"/>
+                  <pic:cNvPr id="0" name="image6.png"/>
                   <pic:cNvPicPr preferRelativeResize="0"/>
                 </pic:nvPicPr>
                 <pic:blipFill>
@@ -1832,12 +1950,12 @@
         <wp:inline distB="0" distT="0" distL="0" distR="0">
           <wp:extent cx="2607673" cy="693219"/>
           <wp:effectExtent b="0" l="0" r="0" t="0"/>
-          <wp:docPr descr="Red text on a white background&#10;&#10;Description automatically generated" id="6" name="image6.jpg"/>
+          <wp:docPr descr="Red text on a white background&#10;&#10;Description automatically generated" id="6" name="image4.jpg"/>
           <a:graphic>
             <a:graphicData uri="http://schemas.openxmlformats.org/drawingml/2006/picture">
               <pic:pic>
                 <pic:nvPicPr>
-                  <pic:cNvPr descr="Red text on a white background&#10;&#10;Description automatically generated" id="0" name="image6.jpg"/>
+                  <pic:cNvPr descr="Red text on a white background&#10;&#10;Description automatically generated" id="0" name="image4.jpg"/>
                   <pic:cNvPicPr preferRelativeResize="0"/>
                 </pic:nvPicPr>
                 <pic:blipFill>
@@ -2136,11 +2254,124 @@
       </w:rPr>
     </w:lvl>
   </w:abstractNum>
+  <w:abstractNum w:abstractNumId="3">
+    <w:lvl w:ilvl="0">
+      <w:start w:val="1"/>
+      <w:numFmt w:val="bullet"/>
+      <w:lvlText w:val="●"/>
+      <w:lvlJc w:val="left"/>
+      <w:pPr>
+        <w:ind w:left="720" w:hanging="360"/>
+      </w:pPr>
+      <w:rPr>
+        <w:u w:val="none"/>
+      </w:rPr>
+    </w:lvl>
+    <w:lvl w:ilvl="1">
+      <w:start w:val="1"/>
+      <w:numFmt w:val="bullet"/>
+      <w:lvlText w:val="○"/>
+      <w:lvlJc w:val="left"/>
+      <w:pPr>
+        <w:ind w:left="1440" w:hanging="360"/>
+      </w:pPr>
+      <w:rPr>
+        <w:u w:val="none"/>
+      </w:rPr>
+    </w:lvl>
+    <w:lvl w:ilvl="2">
+      <w:start w:val="1"/>
+      <w:numFmt w:val="bullet"/>
+      <w:lvlText w:val="■"/>
+      <w:lvlJc w:val="left"/>
+      <w:pPr>
+        <w:ind w:left="2160" w:hanging="360"/>
+      </w:pPr>
+      <w:rPr>
+        <w:u w:val="none"/>
+      </w:rPr>
+    </w:lvl>
+    <w:lvl w:ilvl="3">
+      <w:start w:val="1"/>
+      <w:numFmt w:val="bullet"/>
+      <w:lvlText w:val="●"/>
+      <w:lvlJc w:val="left"/>
+      <w:pPr>
+        <w:ind w:left="2880" w:hanging="360"/>
+      </w:pPr>
+      <w:rPr>
+        <w:u w:val="none"/>
+      </w:rPr>
+    </w:lvl>
+    <w:lvl w:ilvl="4">
+      <w:start w:val="1"/>
+      <w:numFmt w:val="bullet"/>
+      <w:lvlText w:val="○"/>
+      <w:lvlJc w:val="left"/>
+      <w:pPr>
+        <w:ind w:left="3600" w:hanging="360"/>
+      </w:pPr>
+      <w:rPr>
+        <w:u w:val="none"/>
+      </w:rPr>
+    </w:lvl>
+    <w:lvl w:ilvl="5">
+      <w:start w:val="1"/>
+      <w:numFmt w:val="bullet"/>
+      <w:lvlText w:val="■"/>
+      <w:lvlJc w:val="left"/>
+      <w:pPr>
+        <w:ind w:left="4320" w:hanging="360"/>
+      </w:pPr>
+      <w:rPr>
+        <w:u w:val="none"/>
+      </w:rPr>
+    </w:lvl>
+    <w:lvl w:ilvl="6">
+      <w:start w:val="1"/>
+      <w:numFmt w:val="bullet"/>
+      <w:lvlText w:val="●"/>
+      <w:lvlJc w:val="left"/>
+      <w:pPr>
+        <w:ind w:left="5040" w:hanging="360"/>
+      </w:pPr>
+      <w:rPr>
+        <w:u w:val="none"/>
+      </w:rPr>
+    </w:lvl>
+    <w:lvl w:ilvl="7">
+      <w:start w:val="1"/>
+      <w:numFmt w:val="bullet"/>
+      <w:lvlText w:val="○"/>
+      <w:lvlJc w:val="left"/>
+      <w:pPr>
+        <w:ind w:left="5760" w:hanging="360"/>
+      </w:pPr>
+      <w:rPr>
+        <w:u w:val="none"/>
+      </w:rPr>
+    </w:lvl>
+    <w:lvl w:ilvl="8">
+      <w:start w:val="1"/>
+      <w:numFmt w:val="bullet"/>
+      <w:lvlText w:val="■"/>
+      <w:lvlJc w:val="left"/>
+      <w:pPr>
+        <w:ind w:left="6480" w:hanging="360"/>
+      </w:pPr>
+      <w:rPr>
+        <w:u w:val="none"/>
+      </w:rPr>
+    </w:lvl>
+  </w:abstractNum>
   <w:num w:numId="1">
     <w:abstractNumId w:val="1"/>
   </w:num>
   <w:num w:numId="2">
     <w:abstractNumId w:val="2"/>
+  </w:num>
+  <w:num w:numId="3">
+    <w:abstractNumId w:val="3"/>
   </w:num>
 </w:numbering>
 </file>

</xml_diff>